<commit_message>
Hướng dẫn sử dụng: bỏ mục "Xuất PDF" (Phụ lục D) và bảng so sánh máy tính/điện thoại (2.3)
Theo yêu cầu người dùng sau khi đọc lại bản đã dựng.

Co-Authored-By: Claude Sonnet 5 <noreply@anthropic.com>
</commit_message>
<xml_diff>
--- a/huong dan su dung.docx
+++ b/huong dan su dung.docx
@@ -4308,542 +4308,6 @@
     </w:p>
     <w:p>
       <w:pPr>
-        <w:pStyle w:val="Heading3"/>
-        <w:spacing w:after="100" w:before="200"/>
-      </w:pPr>
-      <w:r>
-        <w:rPr>
-          <w:b/>
-          <w:bCs/>
-          <w:color w:val="0F5A55"/>
-        </w:rPr>
-        <w:t xml:space="preserve">So sánh nhanh giữa máy tính và điện thoại</w:t>
-      </w:r>
-    </w:p>
-    <w:tbl>
-      <w:tblPr>
-        <w:tblW w:type="pct" w:w="5000"/>
-        <w:tblBorders>
-          <w:top w:val="single" w:color="auto" w:sz="4"/>
-          <w:left w:val="single" w:color="auto" w:sz="4"/>
-          <w:bottom w:val="single" w:color="auto" w:sz="4"/>
-          <w:right w:val="single" w:color="auto" w:sz="4"/>
-          <w:insideH w:val="single" w:color="auto" w:sz="4"/>
-          <w:insideV w:val="single" w:color="auto" w:sz="4"/>
-        </w:tblBorders>
-      </w:tblPr>
-      <w:tblGrid>
-        <w:gridCol w:w="3105"/>
-        <w:gridCol w:w="3105"/>
-        <w:gridCol w:w="3105"/>
-      </w:tblGrid>
-      <w:tr>
-        <w:trPr>
-          <w:tblHeader/>
-        </w:trPr>
-        <w:tc>
-          <w:tcPr>
-            <w:shd w:fill="14468A" w:color="14468A" w:val="solid"/>
-            <w:tcMar>
-              <w:top w:type="dxa" w:w="80"/>
-              <w:left w:type="dxa" w:w="100"/>
-              <w:bottom w:type="dxa" w:w="80"/>
-              <w:right w:type="dxa" w:w="100"/>
-            </w:tcMar>
-            <w:vAlign w:val="center"/>
-          </w:tcPr>
-          <w:p>
-            <w:r>
-              <w:rPr>
-                <w:b/>
-                <w:bCs/>
-                <w:color w:val="FFFFFF"/>
-                <w:sz w:val="19"/>
-                <w:szCs w:val="19"/>
-              </w:rPr>
-              <w:t xml:space="preserve">Việc</w:t>
-            </w:r>
-          </w:p>
-        </w:tc>
-        <w:tc>
-          <w:tcPr>
-            <w:shd w:fill="14468A" w:color="14468A" w:val="solid"/>
-            <w:tcMar>
-              <w:top w:type="dxa" w:w="80"/>
-              <w:left w:type="dxa" w:w="100"/>
-              <w:bottom w:type="dxa" w:w="80"/>
-              <w:right w:type="dxa" w:w="100"/>
-            </w:tcMar>
-            <w:vAlign w:val="center"/>
-          </w:tcPr>
-          <w:p>
-            <w:r>
-              <w:rPr>
-                <w:b/>
-                <w:bCs/>
-                <w:color w:val="FFFFFF"/>
-                <w:sz w:val="19"/>
-                <w:szCs w:val="19"/>
-              </w:rPr>
-              <w:t xml:space="preserve">Máy tính</w:t>
-            </w:r>
-          </w:p>
-        </w:tc>
-        <w:tc>
-          <w:tcPr>
-            <w:shd w:fill="14468A" w:color="14468A" w:val="solid"/>
-            <w:tcMar>
-              <w:top w:type="dxa" w:w="80"/>
-              <w:left w:type="dxa" w:w="100"/>
-              <w:bottom w:type="dxa" w:w="80"/>
-              <w:right w:type="dxa" w:w="100"/>
-            </w:tcMar>
-            <w:vAlign w:val="center"/>
-          </w:tcPr>
-          <w:p>
-            <w:r>
-              <w:rPr>
-                <w:b/>
-                <w:bCs/>
-                <w:color w:val="FFFFFF"/>
-                <w:sz w:val="19"/>
-                <w:szCs w:val="19"/>
-              </w:rPr>
-              <w:t xml:space="preserve">Điện thoại</w:t>
-            </w:r>
-          </w:p>
-        </w:tc>
-      </w:tr>
-      <w:tr>
-        <w:tc>
-          <w:tcPr>
-            <w:tcMar>
-              <w:top w:type="dxa" w:w="70"/>
-              <w:left w:type="dxa" w:w="100"/>
-              <w:bottom w:type="dxa" w:w="70"/>
-              <w:right w:type="dxa" w:w="100"/>
-            </w:tcMar>
-            <w:vAlign w:val="top"/>
-          </w:tcPr>
-          <w:p>
-            <w:r>
-              <w:rPr>
-                <w:sz w:val="19"/>
-                <w:szCs w:val="19"/>
-              </w:rPr>
-              <w:t xml:space="preserve">Đi đến các mục</w:t>
-            </w:r>
-          </w:p>
-        </w:tc>
-        <w:tc>
-          <w:tcPr>
-            <w:tcMar>
-              <w:top w:type="dxa" w:w="70"/>
-              <w:left w:type="dxa" w:w="100"/>
-              <w:bottom w:type="dxa" w:w="70"/>
-              <w:right w:type="dxa" w:w="100"/>
-            </w:tcMar>
-            <w:vAlign w:val="top"/>
-          </w:tcPr>
-          <w:p>
-            <w:r>
-              <w:rPr>
-                <w:sz w:val="19"/>
-                <w:szCs w:val="19"/>
-              </w:rPr>
-              <w:t xml:space="preserve">Thanh menu bên trái</w:t>
-            </w:r>
-          </w:p>
-        </w:tc>
-        <w:tc>
-          <w:tcPr>
-            <w:tcMar>
-              <w:top w:type="dxa" w:w="70"/>
-              <w:left w:type="dxa" w:w="100"/>
-              <w:bottom w:type="dxa" w:w="70"/>
-              <w:right w:type="dxa" w:w="100"/>
-            </w:tcMar>
-            <w:vAlign w:val="top"/>
-          </w:tcPr>
-          <w:p>
-            <w:r>
-              <w:rPr>
-                <w:sz w:val="19"/>
-                <w:szCs w:val="19"/>
-              </w:rPr>
-              <w:t xml:space="preserve">Thanh 4 nút ở đáy + nút ☰</w:t>
-            </w:r>
-          </w:p>
-        </w:tc>
-      </w:tr>
-      <w:tr>
-        <w:tc>
-          <w:tcPr>
-            <w:shd w:fill="F7F8F6" w:color="F7F8F6" w:val="solid"/>
-            <w:tcMar>
-              <w:top w:type="dxa" w:w="70"/>
-              <w:left w:type="dxa" w:w="100"/>
-              <w:bottom w:type="dxa" w:w="70"/>
-              <w:right w:type="dxa" w:w="100"/>
-            </w:tcMar>
-            <w:vAlign w:val="top"/>
-          </w:tcPr>
-          <w:p>
-            <w:r>
-              <w:rPr>
-                <w:sz w:val="19"/>
-                <w:szCs w:val="19"/>
-              </w:rPr>
-              <w:t xml:space="preserve">Bảng dữ liệu nhiều cột</w:t>
-            </w:r>
-          </w:p>
-        </w:tc>
-        <w:tc>
-          <w:tcPr>
-            <w:shd w:fill="F7F8F6" w:color="F7F8F6" w:val="solid"/>
-            <w:tcMar>
-              <w:top w:type="dxa" w:w="70"/>
-              <w:left w:type="dxa" w:w="100"/>
-              <w:bottom w:type="dxa" w:w="70"/>
-              <w:right w:type="dxa" w:w="100"/>
-            </w:tcMar>
-            <w:vAlign w:val="top"/>
-          </w:tcPr>
-          <w:p>
-            <w:r>
-              <w:rPr>
-                <w:sz w:val="19"/>
-                <w:szCs w:val="19"/>
-              </w:rPr>
-              <w:t xml:space="preserve">Hiện đủ cột</w:t>
-            </w:r>
-          </w:p>
-        </w:tc>
-        <w:tc>
-          <w:tcPr>
-            <w:shd w:fill="F7F8F6" w:color="F7F8F6" w:val="solid"/>
-            <w:tcMar>
-              <w:top w:type="dxa" w:w="70"/>
-              <w:left w:type="dxa" w:w="100"/>
-              <w:bottom w:type="dxa" w:w="70"/>
-              <w:right w:type="dxa" w:w="100"/>
-            </w:tcMar>
-            <w:vAlign w:val="top"/>
-          </w:tcPr>
-          <w:p>
-            <w:r>
-              <w:rPr>
-                <w:sz w:val="19"/>
-                <w:szCs w:val="19"/>
-              </w:rPr>
-              <w:t xml:space="preserve">Mỗi dòng thành một thẻ gọn. Danh sách dài chỉ hiện </w:t>
-            </w:r>
-            <w:r>
-              <w:rPr>
-                <w:b/>
-                <w:bCs/>
-                <w:sz w:val="19"/>
-                <w:szCs w:val="19"/>
-              </w:rPr>
-              <w:t xml:space="preserve">5 dòng đầu</w:t>
-            </w:r>
-            <w:r>
-              <w:rPr>
-                <w:sz w:val="19"/>
-                <w:szCs w:val="19"/>
-              </w:rPr>
-              <w:t xml:space="preserve">, bấm </w:t>
-            </w:r>
-            <w:r>
-              <w:rPr>
-                <w:b/>
-                <w:bCs/>
-                <w:sz w:val="19"/>
-                <w:szCs w:val="19"/>
-              </w:rPr>
-              <w:t xml:space="preserve">"Xem thêm"</w:t>
-            </w:r>
-            <w:r>
-              <w:rPr>
-                <w:sz w:val="19"/>
-                <w:szCs w:val="19"/>
-              </w:rPr>
-              <w:t xml:space="preserve"> để mở tiếp</w:t>
-            </w:r>
-          </w:p>
-        </w:tc>
-      </w:tr>
-      <w:tr>
-        <w:tc>
-          <w:tcPr>
-            <w:tcMar>
-              <w:top w:type="dxa" w:w="70"/>
-              <w:left w:type="dxa" w:w="100"/>
-              <w:bottom w:type="dxa" w:w="70"/>
-              <w:right w:type="dxa" w:w="100"/>
-            </w:tcMar>
-            <w:vAlign w:val="top"/>
-          </w:tcPr>
-          <w:p>
-            <w:r>
-              <w:rPr>
-                <w:sz w:val="19"/>
-                <w:szCs w:val="19"/>
-              </w:rPr>
-              <w:t xml:space="preserve">Form thêm/sửa</w:t>
-            </w:r>
-          </w:p>
-        </w:tc>
-        <w:tc>
-          <w:tcPr>
-            <w:tcMar>
-              <w:top w:type="dxa" w:w="70"/>
-              <w:left w:type="dxa" w:w="100"/>
-              <w:bottom w:type="dxa" w:w="70"/>
-              <w:right w:type="dxa" w:w="100"/>
-            </w:tcMar>
-            <w:vAlign w:val="top"/>
-          </w:tcPr>
-          <w:p>
-            <w:r>
-              <w:rPr>
-                <w:sz w:val="19"/>
-                <w:szCs w:val="19"/>
-              </w:rPr>
-              <w:t xml:space="preserve">Trượt ra từ mép phải màn hình</w:t>
-            </w:r>
-          </w:p>
-        </w:tc>
-        <w:tc>
-          <w:tcPr>
-            <w:tcMar>
-              <w:top w:type="dxa" w:w="70"/>
-              <w:left w:type="dxa" w:w="100"/>
-              <w:bottom w:type="dxa" w:w="70"/>
-              <w:right w:type="dxa" w:w="100"/>
-            </w:tcMar>
-            <w:vAlign w:val="top"/>
-          </w:tcPr>
-          <w:p>
-            <w:r>
-              <w:rPr>
-                <w:b/>
-                <w:bCs/>
-                <w:sz w:val="19"/>
-                <w:szCs w:val="19"/>
-              </w:rPr>
-              <w:t xml:space="preserve">Cửa sổ nổi giữa màn hình</w:t>
-            </w:r>
-            <w:r>
-              <w:rPr>
-                <w:sz w:val="19"/>
-                <w:szCs w:val="19"/>
-              </w:rPr>
-              <w:t xml:space="preserve">, cuộn được, nút Lưu luôn ở dưới cùng</w:t>
-            </w:r>
-          </w:p>
-        </w:tc>
-      </w:tr>
-      <w:tr>
-        <w:tc>
-          <w:tcPr>
-            <w:shd w:fill="F7F8F6" w:color="F7F8F6" w:val="solid"/>
-            <w:tcMar>
-              <w:top w:type="dxa" w:w="70"/>
-              <w:left w:type="dxa" w:w="100"/>
-              <w:bottom w:type="dxa" w:w="70"/>
-              <w:right w:type="dxa" w:w="100"/>
-            </w:tcMar>
-            <w:vAlign w:val="top"/>
-          </w:tcPr>
-          <w:p>
-            <w:r>
-              <w:rPr>
-                <w:sz w:val="19"/>
-                <w:szCs w:val="19"/>
-              </w:rPr>
-              <w:t xml:space="preserve">Chuông thông báo</w:t>
-            </w:r>
-          </w:p>
-        </w:tc>
-        <w:tc>
-          <w:tcPr>
-            <w:shd w:fill="F7F8F6" w:color="F7F8F6" w:val="solid"/>
-            <w:tcMar>
-              <w:top w:type="dxa" w:w="70"/>
-              <w:left w:type="dxa" w:w="100"/>
-              <w:bottom w:type="dxa" w:w="70"/>
-              <w:right w:type="dxa" w:w="100"/>
-            </w:tcMar>
-            <w:vAlign w:val="top"/>
-          </w:tcPr>
-          <w:p>
-            <w:r>
-              <w:rPr>
-                <w:sz w:val="19"/>
-                <w:szCs w:val="19"/>
-              </w:rPr>
-              <w:t xml:space="preserve">Bảng thả xuống dưới chuông</w:t>
-            </w:r>
-          </w:p>
-        </w:tc>
-        <w:tc>
-          <w:tcPr>
-            <w:shd w:fill="F7F8F6" w:color="F7F8F6" w:val="solid"/>
-            <w:tcMar>
-              <w:top w:type="dxa" w:w="70"/>
-              <w:left w:type="dxa" w:w="100"/>
-              <w:bottom w:type="dxa" w:w="70"/>
-              <w:right w:type="dxa" w:w="100"/>
-            </w:tcMar>
-            <w:vAlign w:val="top"/>
-          </w:tcPr>
-          <w:p>
-            <w:r>
-              <w:rPr>
-                <w:sz w:val="19"/>
-                <w:szCs w:val="19"/>
-              </w:rPr>
-              <w:t xml:space="preserve">Cửa sổ nổi giữa màn hình</w:t>
-            </w:r>
-          </w:p>
-        </w:tc>
-      </w:tr>
-      <w:tr>
-        <w:tc>
-          <w:tcPr>
-            <w:tcMar>
-              <w:top w:type="dxa" w:w="70"/>
-              <w:left w:type="dxa" w:w="100"/>
-              <w:bottom w:type="dxa" w:w="70"/>
-              <w:right w:type="dxa" w:w="100"/>
-            </w:tcMar>
-            <w:vAlign w:val="top"/>
-          </w:tcPr>
-          <w:p>
-            <w:r>
-              <w:rPr>
-                <w:sz w:val="19"/>
-                <w:szCs w:val="19"/>
-              </w:rPr>
-              <w:t xml:space="preserve">Ba thẻ số đầu trang Tổng quan</w:t>
-            </w:r>
-          </w:p>
-        </w:tc>
-        <w:tc>
-          <w:tcPr>
-            <w:tcMar>
-              <w:top w:type="dxa" w:w="70"/>
-              <w:left w:type="dxa" w:w="100"/>
-              <w:bottom w:type="dxa" w:w="70"/>
-              <w:right w:type="dxa" w:w="100"/>
-            </w:tcMar>
-            <w:vAlign w:val="top"/>
-          </w:tcPr>
-          <w:p>
-            <w:r>
-              <w:rPr>
-                <w:sz w:val="19"/>
-                <w:szCs w:val="19"/>
-              </w:rPr>
-              <w:t xml:space="preserve">Ba thẻ nằm ngang, bên trái</w:t>
-            </w:r>
-          </w:p>
-        </w:tc>
-        <w:tc>
-          <w:tcPr>
-            <w:tcMar>
-              <w:top w:type="dxa" w:w="70"/>
-              <w:left w:type="dxa" w:w="100"/>
-              <w:bottom w:type="dxa" w:w="70"/>
-              <w:right w:type="dxa" w:w="100"/>
-            </w:tcMar>
-            <w:vAlign w:val="top"/>
-          </w:tcPr>
-          <w:p>
-            <w:r>
-              <w:rPr>
-                <w:sz w:val="19"/>
-                <w:szCs w:val="19"/>
-              </w:rPr>
-              <w:t xml:space="preserve">Ba thẻ nằm ngang, thu gọn và căn giữa</w:t>
-            </w:r>
-          </w:p>
-        </w:tc>
-      </w:tr>
-      <w:tr>
-        <w:tc>
-          <w:tcPr>
-            <w:shd w:fill="F7F8F6" w:color="F7F8F6" w:val="solid"/>
-            <w:tcMar>
-              <w:top w:type="dxa" w:w="70"/>
-              <w:left w:type="dxa" w:w="100"/>
-              <w:bottom w:type="dxa" w:w="70"/>
-              <w:right w:type="dxa" w:w="100"/>
-            </w:tcMar>
-            <w:vAlign w:val="top"/>
-          </w:tcPr>
-          <w:p>
-            <w:r>
-              <w:rPr>
-                <w:sz w:val="19"/>
-                <w:szCs w:val="19"/>
-              </w:rPr>
-              <w:t xml:space="preserve">Nền phía sau khi mở menu/cửa sổ nổi</w:t>
-            </w:r>
-          </w:p>
-        </w:tc>
-        <w:tc>
-          <w:tcPr>
-            <w:shd w:fill="F7F8F6" w:color="F7F8F6" w:val="solid"/>
-            <w:tcMar>
-              <w:top w:type="dxa" w:w="70"/>
-              <w:left w:type="dxa" w:w="100"/>
-              <w:bottom w:type="dxa" w:w="70"/>
-              <w:right w:type="dxa" w:w="100"/>
-            </w:tcMar>
-            <w:vAlign w:val="top"/>
-          </w:tcPr>
-          <w:p>
-            <w:r>
-              <w:rPr>
-                <w:sz w:val="19"/>
-                <w:szCs w:val="19"/>
-              </w:rPr>
-              <w:t xml:space="preserve">Mờ đi</w:t>
-            </w:r>
-          </w:p>
-        </w:tc>
-        <w:tc>
-          <w:tcPr>
-            <w:shd w:fill="F7F8F6" w:color="F7F8F6" w:val="solid"/>
-            <w:tcMar>
-              <w:top w:type="dxa" w:w="70"/>
-              <w:left w:type="dxa" w:w="100"/>
-              <w:bottom w:type="dxa" w:w="70"/>
-              <w:right w:type="dxa" w:w="100"/>
-            </w:tcMar>
-            <w:vAlign w:val="top"/>
-          </w:tcPr>
-          <w:p>
-            <w:r>
-              <w:rPr>
-                <w:sz w:val="19"/>
-                <w:szCs w:val="19"/>
-              </w:rPr>
-              <w:t xml:space="preserve">Mờ đi. Bấm ra vùng mờ để đóng</w:t>
-            </w:r>
-          </w:p>
-        </w:tc>
-      </w:tr>
-    </w:tbl>
-    <w:p>
-      <w:pPr>
-        <w:spacing w:after="160"/>
-      </w:pPr>
-    </w:p>
-    <w:p>
-      <w:pPr>
         <w:pStyle w:val="Heading2"/>
         <w:pBdr>
           <w:bottom w:val="single" w:color="C6DCFA" w:sz="6"/>
@@ -32716,57 +32180,6 @@
       </w:r>
       <w:r>
         <w:t xml:space="preserve"> để bạn không mất công tìm:</w:t>
-      </w:r>
-    </w:p>
-    <w:p>
-      <w:pPr>
-        <w:pStyle w:val="ListParagraph"/>
-        <w:numPr>
-          <w:ilvl w:val="0"/>
-          <w:numId w:val="1"/>
-        </w:numPr>
-        <w:spacing w:after="40"/>
-        <w:jc w:val="both"/>
-      </w:pPr>
-      <w:r>
-        <w:rPr>
-          <w:b/>
-          <w:bCs/>
-        </w:rPr>
-        <w:t xml:space="preserve">Xuất PDF:</w:t>
-      </w:r>
-      <w:r>
-        <w:t xml:space="preserve"> đã từng có, nhưng </w:t>
-      </w:r>
-      <w:r>
-        <w:rPr>
-          <w:b/>
-          <w:bCs/>
-        </w:rPr>
-        <w:t xml:space="preserve">bỏ hẳn</w:t>
-      </w:r>
-      <w:r>
-        <w:t xml:space="preserve"> theo phản hồi người dùng (trình bày chưa đẹp, không hiệu quả bằng Excel) — không phải điểm còn thiếu, mà là quyết định không làm nữa. Mọi việc xuất báo cáo dùng </w:t>
-      </w:r>
-      <w:r>
-        <w:rPr>
-          <w:b/>
-          <w:bCs/>
-        </w:rPr>
-        <w:t xml:space="preserve">Xuất Excel</w:t>
-      </w:r>
-      <w:r>
-        <w:t xml:space="preserve"> hoặc </w:t>
-      </w:r>
-      <w:r>
-        <w:rPr>
-          <w:b/>
-          <w:bCs/>
-        </w:rPr>
-        <w:t xml:space="preserve">Xuất dữ liệu chi tiết</w:t>
-      </w:r>
-      <w:r>
-        <w:t xml:space="preserve"> (mục 5.11).</w:t>
       </w:r>
     </w:p>
     <w:p>

</xml_diff>

<commit_message>
Lịch lớp học: chấm rỗng cho lớp sắp mở, đếm Bài đúng trong tháng; dữ liệu demo có lớp sắp tới
- Lớp Dự kiến công khai sớm hiện chấm rỗng (viền) thay vì chấm nhạt — tránh lẫn với lớp màu xanh dương nhạt
- Dòng "N Bài, M lớp" chỉ đếm Bài trong tháng đang xem (bỏ các ngày mờ đầu/cuối lưới)
- demo-huong-dan.mjs: thêm ~2 tháng lớp sắp tới (đủ/thiếu người, sắp mở, cặp Bài trùng giờ của Hero GV)
- Chụp lại ảnh 3.2b, dựng lại PDF + Word

Co-Authored-By: Claude Opus 5.5 <noreply@anthropic.com>
</commit_message>
<xml_diff>
--- a/huong dan su dung.docx
+++ b/huong dan su dung.docx
@@ -5929,10 +5929,10 @@
           <w:b/>
           <w:bCs/>
         </w:rPr>
-        <w:t xml:space="preserve">Chấm nhạt</w:t>
-      </w:r>
-      <w:r>
-        <w:t xml:space="preserve"> là Bài của lớp </w:t>
+        <w:t xml:space="preserve">Chấm rỗng</w:t>
+      </w:r>
+      <w:r>
+        <w:t xml:space="preserve"> (chỉ có viền) là Bài của lớp </w:t>
       </w:r>
       <w:r>
         <w:rPr>

</xml_diff>

<commit_message>
Tài liệu hướng dẫn: chụp lại ảnh lịch (3.2b, 3.6, 2.3b) theo lịch gom 1 chỗ, dựng lại PDF + Word
Co-Authored-By: Claude Opus 5.5 <noreply@anthropic.com>
</commit_message>
<xml_diff>
--- a/huong dan su dung.docx
+++ b/huong dan su dung.docx
@@ -4122,7 +4122,7 @@
           <w:b/>
           <w:bCs/>
         </w:rPr>
-        <w:t xml:space="preserve">Lịch dạy</w:t>
+        <w:t xml:space="preserve">Lịch</w:t>
       </w:r>
       <w:r>
         <w:t xml:space="preserve">, </w:t>
@@ -5245,7 +5245,17 @@
         <w:t xml:space="preserve">Xem lịch tháng</w:t>
       </w:r>
       <w:r>
-        <w:t xml:space="preserve"> để sang lịch tháng đầy đủ (mục 3.6).</w:t>
+        <w:t xml:space="preserve"> để mở lịch ở chế độ </w:t>
+      </w:r>
+      <w:r>
+        <w:rPr>
+          <w:b/>
+          <w:bCs/>
+        </w:rPr>
+        <w:t xml:space="preserve">Của tôi</w:t>
+      </w:r>
+      <w:r>
+        <w:t xml:space="preserve"> (mục 3.6).</w:t>
       </w:r>
     </w:p>
     <w:p>
@@ -5852,7 +5862,7 @@
           <w:bCs/>
           <w:color w:val="0F5A55"/>
         </w:rPr>
-        <w:t xml:space="preserve">Xem lịch các lớp sắp tới</w:t>
+        <w:t xml:space="preserve">Xem lịch các lớp</w:t>
       </w:r>
     </w:p>
     <w:p>
@@ -5861,7 +5871,67 @@
         <w:jc w:val="both"/>
       </w:pPr>
       <w:r>
-        <w:t xml:space="preserve">Để biết trước lớp nào rơi vào ngày nào và </w:t>
+        <w:t xml:space="preserve">Mọi lịch trong hệ thống nằm ở </w:t>
+      </w:r>
+      <w:r>
+        <w:rPr>
+          <w:b/>
+          <w:bCs/>
+        </w:rPr>
+        <w:t xml:space="preserve">một chỗ duy nhất</w:t>
+      </w:r>
+      <w:r>
+        <w:t xml:space="preserve">: nút </w:t>
+      </w:r>
+      <w:r>
+        <w:rPr>
+          <w:b/>
+          <w:bCs/>
+        </w:rPr>
+        <w:t xml:space="preserve">Lịch</w:t>
+      </w:r>
+      <w:r>
+        <w:t xml:space="preserve"> (cạnh nút </w:t>
+      </w:r>
+      <w:r>
+        <w:rPr>
+          <w:b/>
+          <w:bCs/>
+        </w:rPr>
+        <w:t xml:space="preserve">Danh sách</w:t>
+      </w:r>
+      <w:r>
+        <w:t xml:space="preserve">) ở đầu trang Lớp học. </w:t>
+      </w:r>
+      <w:r>
+        <w:rPr>
+          <w:b/>
+          <w:bCs/>
+        </w:rPr>
+        <w:t xml:space="preserve">Biểu tượng lịch</w:t>
+      </w:r>
+      <w:r>
+        <w:t xml:space="preserve"> trên thanh trên cùng, nút </w:t>
+      </w:r>
+      <w:r>
+        <w:rPr>
+          <w:b/>
+          <w:bCs/>
+        </w:rPr>
+        <w:t xml:space="preserve">Lịch</w:t>
+      </w:r>
+      <w:r>
+        <w:t xml:space="preserve"> ở đáy màn hình điện thoại và liên kết </w:t>
+      </w:r>
+      <w:r>
+        <w:rPr>
+          <w:b/>
+          <w:bCs/>
+        </w:rPr>
+        <w:t xml:space="preserve">Xem lịch tháng</w:t>
+      </w:r>
+      <w:r>
+        <w:t xml:space="preserve"> ở trang Tổng quan đều mở thẳng tới đây. Lịch giúp bạn biết trước lớp nào diễn ra vào những ngày nào để </w:t>
       </w:r>
       <w:r>
         <w:rPr>
@@ -5871,27 +5941,7 @@
         <w:t xml:space="preserve">chủ động sắp xếp thời gian</w:t>
       </w:r>
       <w:r>
-        <w:t xml:space="preserve"> trước khi đăng ký, bấm nút </w:t>
-      </w:r>
-      <w:r>
-        <w:rPr>
-          <w:b/>
-          <w:bCs/>
-        </w:rPr>
-        <w:t xml:space="preserve">Lịch</w:t>
-      </w:r>
-      <w:r>
-        <w:t xml:space="preserve"> (cạnh nút </w:t>
-      </w:r>
-      <w:r>
-        <w:rPr>
-          <w:b/>
-          <w:bCs/>
-        </w:rPr>
-        <w:t xml:space="preserve">Danh sách</w:t>
-      </w:r>
-      <w:r>
-        <w:t xml:space="preserve">) ở đầu trang Lớp học:</w:t>
+        <w:t xml:space="preserve"> trước khi đăng ký.</w:t>
       </w:r>
     </w:p>
     <w:p>
@@ -5905,61 +5955,84 @@
         <w:jc w:val="both"/>
       </w:pPr>
       <w:r>
-        <w:rPr>
-          <w:b/>
-          <w:bCs/>
-        </w:rPr>
-        <w:t xml:space="preserve">Lưới tháng</w:t>
-      </w:r>
-      <w:r>
-        <w:t xml:space="preserve">: mỗi ngày có Bài hiện </w:t>
-      </w:r>
-      <w:r>
-        <w:rPr>
-          <w:b/>
-          <w:bCs/>
-        </w:rPr>
-        <w:t xml:space="preserve">chấm màu</w:t>
-      </w:r>
-      <w:r>
-        <w:t xml:space="preserve">, mỗi màu là một lớp. </w:t>
-      </w:r>
-      <w:r>
-        <w:rPr>
-          <w:b/>
-          <w:bCs/>
-        </w:rPr>
-        <w:t xml:space="preserve">Chấm rỗng</w:t>
-      </w:r>
-      <w:r>
-        <w:t xml:space="preserve"> (chỉ có viền) là Bài của lớp </w:t>
-      </w:r>
-      <w:r>
-        <w:rPr>
-          <w:b/>
-          <w:bCs/>
-        </w:rPr>
-        <w:t xml:space="preserve">sắp mở</w:t>
-      </w:r>
-      <w:r>
-        <w:t xml:space="preserve"> (còn Dự kiến). </w:t>
-      </w:r>
-      <w:r>
-        <w:rPr>
-          <w:b/>
-          <w:bCs/>
-        </w:rPr>
-        <w:t xml:space="preserve">Vạch đỏ</w:t>
-      </w:r>
-      <w:r>
-        <w:t xml:space="preserve"> dưới ngày nghĩa là ngày đó có Bài </w:t>
-      </w:r>
-      <w:r>
-        <w:rPr>
-          <w:b/>
-          <w:bCs/>
-        </w:rPr>
-        <w:t xml:space="preserve">còn thiếu người</w:t>
+        <w:t xml:space="preserve">Mỗi </w:t>
+      </w:r>
+      <w:r>
+        <w:rPr>
+          <w:b/>
+          <w:bCs/>
+        </w:rPr>
+        <w:t xml:space="preserve">lớp</w:t>
+      </w:r>
+      <w:r>
+        <w:t xml:space="preserve"> là một </w:t>
+      </w:r>
+      <w:r>
+        <w:rPr>
+          <w:b/>
+          <w:bCs/>
+        </w:rPr>
+        <w:t xml:space="preserve">thanh ngang</w:t>
+      </w:r>
+      <w:r>
+        <w:t xml:space="preserve"> kéo dài từ ngày bắt đầu đến ngày kết thúc. </w:t>
+      </w:r>
+      <w:r>
+        <w:rPr>
+          <w:b/>
+          <w:bCs/>
+        </w:rPr>
+        <w:t xml:space="preserve">Màu thanh cho biết trạng thái</w:t>
+      </w:r>
+      <w:r>
+        <w:t xml:space="preserve">: viền nét đứt là </w:t>
+      </w:r>
+      <w:r>
+        <w:rPr>
+          <w:b/>
+          <w:bCs/>
+        </w:rPr>
+        <w:t xml:space="preserve">Sắp mở</w:t>
+      </w:r>
+      <w:r>
+        <w:t xml:space="preserve"> (lớp còn Dự kiến, chưa đăng ký được), xanh dương là </w:t>
+      </w:r>
+      <w:r>
+        <w:rPr>
+          <w:b/>
+          <w:bCs/>
+        </w:rPr>
+        <w:t xml:space="preserve">Đang mở đăng ký</w:t>
+      </w:r>
+      <w:r>
+        <w:t xml:space="preserve">, xanh lá là </w:t>
+      </w:r>
+      <w:r>
+        <w:rPr>
+          <w:b/>
+          <w:bCs/>
+        </w:rPr>
+        <w:t xml:space="preserve">Đã đủ đăng ký</w:t>
+      </w:r>
+      <w:r>
+        <w:t xml:space="preserve">, xanh ngọc là </w:t>
+      </w:r>
+      <w:r>
+        <w:rPr>
+          <w:b/>
+          <w:bCs/>
+        </w:rPr>
+        <w:t xml:space="preserve">Đang diễn ra</w:t>
+      </w:r>
+      <w:r>
+        <w:t xml:space="preserve">, xám là </w:t>
+      </w:r>
+      <w:r>
+        <w:rPr>
+          <w:b/>
+          <w:bCs/>
+        </w:rPr>
+        <w:t xml:space="preserve">Đã hoàn thành</w:t>
       </w:r>
       <w:r>
         <w:t xml:space="preserve">.</w:t>
@@ -5976,27 +6049,24 @@
         <w:jc w:val="both"/>
       </w:pPr>
       <w:r>
-        <w:t xml:space="preserve">Bấm mũi tên </w:t>
-      </w:r>
-      <w:r>
-        <w:rPr>
-          <w:b/>
-          <w:bCs/>
-        </w:rPr>
-        <w:t xml:space="preserve">‹ ›</w:t>
-      </w:r>
-      <w:r>
-        <w:t xml:space="preserve"> để sang tháng trước/sau, </w:t>
-      </w:r>
-      <w:r>
-        <w:rPr>
-          <w:b/>
-          <w:bCs/>
-        </w:rPr>
-        <w:t xml:space="preserve">Hôm nay</w:t>
-      </w:r>
-      <w:r>
-        <w:t xml:space="preserve"> để quay lại tháng hiện tại.</w:t>
+        <w:rPr>
+          <w:b/>
+          <w:bCs/>
+        </w:rPr>
+        <w:t xml:space="preserve">Chấm đỏ</w:t>
+      </w:r>
+      <w:r>
+        <w:t xml:space="preserve"> trên thanh nghĩa là lớp </w:t>
+      </w:r>
+      <w:r>
+        <w:rPr>
+          <w:b/>
+          <w:bCs/>
+        </w:rPr>
+        <w:t xml:space="preserve">còn thiếu người</w:t>
+      </w:r>
+      <w:r>
+        <w:t xml:space="preserve">.</w:t>
       </w:r>
     </w:p>
     <w:p>
@@ -6014,30 +6084,10 @@
           <w:b/>
           <w:bCs/>
         </w:rPr>
-        <w:t xml:space="preserve">Bấm vào một ngày</w:t>
-      </w:r>
-      <w:r>
-        <w:t xml:space="preserve"> để xem các Bài trong ngày: tên Bài, lớp, giờ, địa điểm, trạng thái lớp (</w:t>
-      </w:r>
-      <w:r>
-        <w:rPr>
-          <w:b/>
-          <w:bCs/>
-        </w:rPr>
-        <w:t xml:space="preserve">Sắp mở</w:t>
-      </w:r>
-      <w:r>
-        <w:t xml:space="preserve">, Đang mở đăng ký…) và số slot đã có người theo vai trò, ví dụ </w:t>
-      </w:r>
-      <w:r>
-        <w:rPr>
-          <w:b/>
-          <w:bCs/>
-        </w:rPr>
-        <w:t xml:space="preserve">GV 0/1 · TG 1/3</w:t>
-      </w:r>
-      <w:r>
-        <w:t xml:space="preserve">.</w:t>
+        <w:t xml:space="preserve">Bấm vào thanh</w:t>
+      </w:r>
+      <w:r>
+        <w:t xml:space="preserve"> để mở trang lớp (xem các Bài, đăng ký…).</w:t>
       </w:r>
     </w:p>
     <w:p>
@@ -6051,37 +6101,37 @@
         <w:jc w:val="both"/>
       </w:pPr>
       <w:r>
-        <w:t xml:space="preserve">Các nhãn riêng của bạn: </w:t>
-      </w:r>
-      <w:r>
-        <w:rPr>
-          <w:b/>
-          <w:bCs/>
-        </w:rPr>
-        <w:t xml:space="preserve">Bạn dạy</w:t>
-      </w:r>
-      <w:r>
-        <w:t xml:space="preserve"> (Bài bạn đã được phân công), </w:t>
-      </w:r>
-      <w:r>
-        <w:rPr>
-          <w:b/>
-          <w:bCs/>
-        </w:rPr>
-        <w:t xml:space="preserve">Trùng lịch của bạn</w:t>
-      </w:r>
-      <w:r>
-        <w:t xml:space="preserve"> (giao giờ với Bài bạn đã nhận — không đăng ký được), </w:t>
-      </w:r>
-      <w:r>
-        <w:rPr>
-          <w:b/>
-          <w:bCs/>
-        </w:rPr>
-        <w:t xml:space="preserve">Phù hợp với bạn</w:t>
-      </w:r>
-      <w:r>
-        <w:t xml:space="preserve"> (bạn đủ điều kiện và Bài còn thiếu người).</w:t>
+        <w:t xml:space="preserve">Bấm </w:t>
+      </w:r>
+      <w:r>
+        <w:rPr>
+          <w:b/>
+          <w:bCs/>
+        </w:rPr>
+        <w:t xml:space="preserve">‹ ›</w:t>
+      </w:r>
+      <w:r>
+        <w:t xml:space="preserve"> để sang tháng trước/sau, </w:t>
+      </w:r>
+      <w:r>
+        <w:rPr>
+          <w:b/>
+          <w:bCs/>
+        </w:rPr>
+        <w:t xml:space="preserve">Hôm nay</w:t>
+      </w:r>
+      <w:r>
+        <w:t xml:space="preserve"> để quay lại tháng hiện tại. Có thể lọc theo </w:t>
+      </w:r>
+      <w:r>
+        <w:rPr>
+          <w:b/>
+          <w:bCs/>
+        </w:rPr>
+        <w:t xml:space="preserve">nhóm lớp</w:t>
+      </w:r>
+      <w:r>
+        <w:t xml:space="preserve">.</w:t>
       </w:r>
     </w:p>
     <w:p>
@@ -6095,47 +6145,62 @@
         <w:jc w:val="both"/>
       </w:pPr>
       <w:r>
-        <w:t xml:space="preserve">Bấm </w:t>
-      </w:r>
-      <w:r>
-        <w:rPr>
-          <w:b/>
-          <w:bCs/>
-        </w:rPr>
-        <w:t xml:space="preserve">Phù hợp với tôi</w:t>
-      </w:r>
-      <w:r>
-        <w:t xml:space="preserve"> để chỉ hiện các lớp bạn đủ điều kiện đăng ký. Các bộ lọc nhóm lớp, trạng thái… ở trên cũng áp dụng cho lịch.</w:t>
-      </w:r>
-    </w:p>
-    <w:p>
-      <w:pPr>
-        <w:pStyle w:val="ListParagraph"/>
-        <w:numPr>
-          <w:ilvl w:val="0"/>
-          <w:numId w:val="1"/>
-        </w:numPr>
-        <w:spacing w:after="40"/>
-        <w:jc w:val="both"/>
-      </w:pPr>
-      <w:r>
-        <w:t xml:space="preserve">Bấm tên Bài để vào trang chi tiết lớp. Lớp </w:t>
-      </w:r>
-      <w:r>
-        <w:rPr>
-          <w:b/>
-          <w:bCs/>
-        </w:rPr>
-        <w:t xml:space="preserve">Sắp mở</w:t>
-      </w:r>
-      <w:r>
-        <w:t xml:space="preserve"> chưa đăng ký được — hãy giữ lịch trống, khi lớp mở đăng ký bạn sẽ nhận thông báo.</w:t>
+        <w:t xml:space="preserve">Trên điện thoại, lịch hiện dạng </w:t>
+      </w:r>
+      <w:r>
+        <w:rPr>
+          <w:b/>
+          <w:bCs/>
+        </w:rPr>
+        <w:t xml:space="preserve">danh sách lớp theo tuần</w:t>
+      </w:r>
+      <w:r>
+        <w:t xml:space="preserve"> cho dễ đọc.</w:t>
       </w:r>
     </w:p>
     <w:p>
       <w:pPr>
         <w:spacing w:after="100"/>
       </w:pPr>
+    </w:p>
+    <w:p>
+      <w:pPr>
+        <w:spacing w:after="160"/>
+        <w:jc w:val="both"/>
+      </w:pPr>
+      <w:r>
+        <w:t xml:space="preserve">Lịch có hai chế độ: </w:t>
+      </w:r>
+      <w:r>
+        <w:rPr>
+          <w:b/>
+          <w:bCs/>
+        </w:rPr>
+        <w:t xml:space="preserve">Tất cả lớp</w:t>
+      </w:r>
+      <w:r>
+        <w:t xml:space="preserve"> (mặc định) và </w:t>
+      </w:r>
+      <w:r>
+        <w:rPr>
+          <w:b/>
+          <w:bCs/>
+        </w:rPr>
+        <w:t xml:space="preserve">Của tôi</w:t>
+      </w:r>
+      <w:r>
+        <w:t xml:space="preserve"> (chỉ các lớp bạn được phân công, kèm danh sách </w:t>
+      </w:r>
+      <w:r>
+        <w:rPr>
+          <w:b/>
+          <w:bCs/>
+        </w:rPr>
+        <w:t xml:space="preserve">Buổi dạy của tôi trong tháng</w:t>
+      </w:r>
+      <w:r>
+        <w:t xml:space="preserve"> — xem mục 3.6).</w:t>
+      </w:r>
     </w:p>
     <w:p>
       <w:pPr>
@@ -6196,7 +6261,7 @@
           <w:sz w:val="18"/>
           <w:szCs w:val="18"/>
         </w:rPr>
-        <w:t xml:space="preserve">Ảnh 3.2b — Lịch các lớp: lưới tháng và các Bài của ngày đã chọn</w:t>
+        <w:t xml:space="preserve">Ảnh 3.2b — Lịch các lớp: mỗi lớp một thanh, màu theo trạng thái</w:t>
       </w:r>
     </w:p>
     <w:p>
@@ -6217,27 +6282,17 @@
         <w:t xml:space="preserve">Mẹo:</w:t>
       </w:r>
       <w:r>
-        <w:t xml:space="preserve"> "Lịch các lớp" khác với "Lịch dạy của tôi" (mục 3.6): lịch các lớp cho thấy </w:t>
-      </w:r>
-      <w:r>
-        <w:rPr>
-          <w:b/>
-          <w:bCs/>
-        </w:rPr>
-        <w:t xml:space="preserve">mọi lớp</w:t>
-      </w:r>
-      <w:r>
-        <w:t xml:space="preserve"> để bạn lên kế hoạch, còn lịch dạy của tôi chỉ có các Bài </w:t>
-      </w:r>
-      <w:r>
-        <w:rPr>
-          <w:b/>
-          <w:bCs/>
-        </w:rPr>
-        <w:t xml:space="preserve">bạn đã được phân công</w:t>
-      </w:r>
-      <w:r>
-        <w:t xml:space="preserve">.</w:t>
+        <w:t xml:space="preserve"> Lớp </w:t>
+      </w:r>
+      <w:r>
+        <w:rPr>
+          <w:b/>
+          <w:bCs/>
+        </w:rPr>
+        <w:t xml:space="preserve">Sắp mở</w:t>
+      </w:r>
+      <w:r>
+        <w:t xml:space="preserve"> chưa đăng ký được — hãy giữ lịch trống, khi lớp mở đăng ký bạn sẽ nhận thông báo.</w:t>
       </w:r>
     </w:p>
     <w:p>
@@ -7877,17 +7932,27 @@
         <w:jc w:val="both"/>
       </w:pPr>
       <w:r>
-        <w:t xml:space="preserve">Trang này gom </w:t>
-      </w:r>
-      <w:r>
-        <w:rPr>
-          <w:b/>
-          <w:bCs/>
-        </w:rPr>
-        <w:t xml:space="preserve">việc của bạn</w:t>
-      </w:r>
-      <w:r>
-        <w:t xml:space="preserve"> vào một nơi. Từ trên xuống:</w:t>
+        <w:t xml:space="preserve">Trang </w:t>
+      </w:r>
+      <w:r>
+        <w:rPr>
+          <w:b/>
+          <w:bCs/>
+        </w:rPr>
+        <w:t xml:space="preserve">Đăng ký giảng dạy</w:t>
+      </w:r>
+      <w:r>
+        <w:t xml:space="preserve"> gom </w:t>
+      </w:r>
+      <w:r>
+        <w:rPr>
+          <w:b/>
+          <w:bCs/>
+        </w:rPr>
+        <w:t xml:space="preserve">việc cần làm</w:t>
+      </w:r>
+      <w:r>
+        <w:t xml:space="preserve"> của bạn vào một nơi:</w:t>
       </w:r>
     </w:p>
     <w:p>
@@ -7932,26 +7997,6 @@
     </w:p>
     <w:p>
       <w:pPr>
-        <w:spacing w:after="40"/>
-        <w:ind w:left="400"/>
-        <w:jc w:val="both"/>
-      </w:pPr>
-      <w:r>
-        <w:t xml:space="preserve">3. </w:t>
-      </w:r>
-      <w:r>
-        <w:rPr>
-          <w:b/>
-          <w:bCs/>
-        </w:rPr>
-        <w:t xml:space="preserve">Lịch dạy của tôi</w:t>
-      </w:r>
-      <w:r>
-        <w:t xml:space="preserve"> (lưới lịch tháng) ở cuối trang.</w:t>
-      </w:r>
-    </w:p>
-    <w:p>
-      <w:pPr>
         <w:spacing w:after="100"/>
       </w:pPr>
     </w:p>
@@ -7975,27 +8020,17 @@
         <w:jc w:val="both"/>
       </w:pPr>
       <w:r>
-        <w:t xml:space="preserve">Lịch chỉ hiển thị các Bài </w:t>
-      </w:r>
-      <w:r>
-        <w:rPr>
-          <w:b/>
-          <w:bCs/>
-        </w:rPr>
-        <w:t xml:space="preserve">đã được phân công cho bạn</w:t>
-      </w:r>
-      <w:r>
-        <w:t xml:space="preserve">. Các đăng ký chờ duyệt và slot trống </w:t>
-      </w:r>
-      <w:r>
-        <w:rPr>
-          <w:b/>
-          <w:bCs/>
-        </w:rPr>
-        <w:t xml:space="preserve">không</w:t>
-      </w:r>
-      <w:r>
-        <w:t xml:space="preserve"> hiện trên lịch.</w:t>
+        <w:t xml:space="preserve">Lịch dạy của bạn nằm ở </w:t>
+      </w:r>
+      <w:r>
+        <w:rPr>
+          <w:b/>
+          <w:bCs/>
+        </w:rPr>
+        <w:t xml:space="preserve">Lớp học → Lịch → Của tôi</w:t>
+      </w:r>
+      <w:r>
+        <w:t xml:space="preserve"> (cùng chỗ với lịch các lớp, mục 3.2):</w:t>
       </w:r>
     </w:p>
     <w:p>
@@ -8009,27 +8044,27 @@
         <w:jc w:val="both"/>
       </w:pPr>
       <w:r>
-        <w:t xml:space="preserve">Ngày có Bài hiện </w:t>
-      </w:r>
-      <w:r>
-        <w:rPr>
-          <w:b/>
-          <w:bCs/>
-        </w:rPr>
-        <w:t xml:space="preserve">chấm màu</w:t>
-      </w:r>
-      <w:r>
-        <w:t xml:space="preserve"> ở dưới số ngày. </w:t>
-      </w:r>
-      <w:r>
-        <w:rPr>
-          <w:b/>
-          <w:bCs/>
-        </w:rPr>
-        <w:t xml:space="preserve">Mỗi lớp một màu</w:t>
-      </w:r>
-      <w:r>
-        <w:t xml:space="preserve">, nên bạn nhìn màu biết ngay hai Bài có cùng lớp hay không.</w:t>
+        <w:t xml:space="preserve">Lưới tháng chỉ còn các lớp </w:t>
+      </w:r>
+      <w:r>
+        <w:rPr>
+          <w:b/>
+          <w:bCs/>
+        </w:rPr>
+        <w:t xml:space="preserve">bạn đã được phân công</w:t>
+      </w:r>
+      <w:r>
+        <w:t xml:space="preserve">. Đăng ký chờ duyệt và slot trống </w:t>
+      </w:r>
+      <w:r>
+        <w:rPr>
+          <w:b/>
+          <w:bCs/>
+        </w:rPr>
+        <w:t xml:space="preserve">không</w:t>
+      </w:r>
+      <w:r>
+        <w:t xml:space="preserve"> tính.</w:t>
       </w:r>
     </w:p>
     <w:p>
@@ -8043,117 +8078,23 @@
         <w:jc w:val="both"/>
       </w:pPr>
       <w:r>
-        <w:rPr>
-          <w:b/>
-          <w:bCs/>
-        </w:rPr>
-        <w:t xml:space="preserve">Hôm nay</w:t>
-      </w:r>
-      <w:r>
-        <w:t xml:space="preserve"> có vòng tròn mảnh quanh số. </w:t>
-      </w:r>
-      <w:r>
-        <w:rPr>
-          <w:b/>
-          <w:bCs/>
-        </w:rPr>
-        <w:t xml:space="preserve">Ngày đang chọn</w:t>
-      </w:r>
-      <w:r>
-        <w:t xml:space="preserve"> có vòng tròn tô màu.</w:t>
-      </w:r>
-    </w:p>
-    <w:p>
-      <w:pPr>
-        <w:pStyle w:val="ListParagraph"/>
-        <w:numPr>
-          <w:ilvl w:val="0"/>
-          <w:numId w:val="1"/>
-        </w:numPr>
-        <w:spacing w:after="40"/>
-        <w:jc w:val="both"/>
-      </w:pPr>
-      <w:r>
-        <w:t xml:space="preserve">Bấm vào một ngày để xem danh sách Bài ngày đó ngay bên dưới: giờ, tên Bài, tên lớp và vai trò. Bấm tên Bài để mở trang lớp.</w:t>
-      </w:r>
-    </w:p>
-    <w:p>
-      <w:pPr>
-        <w:pStyle w:val="ListParagraph"/>
-        <w:numPr>
-          <w:ilvl w:val="0"/>
-          <w:numId w:val="1"/>
-        </w:numPr>
-        <w:spacing w:after="40"/>
-        <w:jc w:val="both"/>
-      </w:pPr>
-      <w:r>
-        <w:t xml:space="preserve">Dùng nút </w:t>
-      </w:r>
-      <w:r>
-        <w:rPr>
-          <w:b/>
-          <w:bCs/>
-        </w:rPr>
-        <w:t xml:space="preserve">‹</w:t>
-      </w:r>
-      <w:r>
-        <w:t xml:space="preserve"> và </w:t>
-      </w:r>
-      <w:r>
-        <w:rPr>
-          <w:b/>
-          <w:bCs/>
-        </w:rPr>
-        <w:t xml:space="preserve">›</w:t>
-      </w:r>
-      <w:r>
-        <w:t xml:space="preserve"> để chuyển tháng, nút </w:t>
-      </w:r>
-      <w:r>
-        <w:rPr>
-          <w:b/>
-          <w:bCs/>
-        </w:rPr>
-        <w:t xml:space="preserve">Hôm nay</w:t>
-      </w:r>
-      <w:r>
-        <w:t xml:space="preserve"> để về ngày hiện tại.</w:t>
+        <w:t xml:space="preserve">Bên dưới là </w:t>
+      </w:r>
+      <w:r>
+        <w:rPr>
+          <w:b/>
+          <w:bCs/>
+        </w:rPr>
+        <w:t xml:space="preserve">Buổi dạy của tôi trong tháng</w:t>
+      </w:r>
+      <w:r>
+        <w:t xml:space="preserve">: thứ, ngày, giờ, tên Bài, tên lớp và vai trò của từng buổi. Bấm tên Bài để mở trang lớp.</w:t>
       </w:r>
     </w:p>
     <w:p>
       <w:pPr>
         <w:spacing w:after="100"/>
       </w:pPr>
-    </w:p>
-    <w:p>
-      <w:pPr>
-        <w:spacing w:after="160"/>
-        <w:jc w:val="both"/>
-      </w:pPr>
-      <w:r>
-        <w:t xml:space="preserve">Bạn cũng có thể vào nhanh lịch này bằng </w:t>
-      </w:r>
-      <w:r>
-        <w:rPr>
-          <w:b/>
-          <w:bCs/>
-        </w:rPr>
-        <w:t xml:space="preserve">biểu tượng lịch</w:t>
-      </w:r>
-      <w:r>
-        <w:t xml:space="preserve"> trên thanh trên cùng (máy tính) hoặc nút </w:t>
-      </w:r>
-      <w:r>
-        <w:rPr>
-          <w:b/>
-          <w:bCs/>
-        </w:rPr>
-        <w:t xml:space="preserve">Lịch dạy</w:t>
-      </w:r>
-      <w:r>
-        <w:t xml:space="preserve"> ở đáy màn hình (điện thoại).</w:t>
-      </w:r>
     </w:p>
     <w:p>
       <w:pPr>
@@ -8163,7 +8104,7 @@
       <w:r>
         <w:drawing>
           <wp:inline distT="0" distB="0" distL="0" distR="0">
-            <wp:extent cx="5905500" cy="4152900"/>
+            <wp:extent cx="5905500" cy="5200650"/>
             <wp:effectExtent t="0" r="0" b="0" l="0"/>
             <wp:docPr id="13" name="" descr="" title=""/>
             <wp:cNvGraphicFramePr>
@@ -8188,7 +8129,7 @@
                   <pic:spPr bwMode="auto">
                     <a:xfrm>
                       <a:off x="0" y="0"/>
-                      <a:ext cx="5905500" cy="4152900"/>
+                      <a:ext cx="5905500" cy="5200650"/>
                     </a:xfrm>
                     <a:prstGeom prst="rect">
                       <a:avLst/>
@@ -8214,7 +8155,7 @@
           <w:sz w:val="18"/>
           <w:szCs w:val="18"/>
         </w:rPr>
-        <w:t xml:space="preserve">Ảnh 3.6 — Lịch dạy của tôi (lịch tháng)</w:t>
+        <w:t xml:space="preserve">Ảnh 3.6 — Lịch ở chế độ "Của tôi" và danh sách buổi dạy trong tháng</w:t>
       </w:r>
     </w:p>
     <w:p>
@@ -18235,27 +18176,17 @@
         <w:t xml:space="preserve">Lịch</w:t>
       </w:r>
       <w:r>
-        <w:t xml:space="preserve"> của trang Lớp học. Quản lý cũng dùng chế độ Lịch để rà nhanh những ngày có </w:t>
-      </w:r>
-      <w:r>
-        <w:rPr>
-          <w:b/>
-          <w:bCs/>
-        </w:rPr>
-        <w:t xml:space="preserve">vạch đỏ</w:t>
-      </w:r>
-      <w:r>
-        <w:t xml:space="preserve"> (Bài còn thiếu người) mà mời thêm người. Người quản lý không có hồ sơ giảng dạy bấm </w:t>
-      </w:r>
-      <w:r>
-        <w:rPr>
-          <w:b/>
-          <w:bCs/>
-        </w:rPr>
-        <w:t xml:space="preserve">biểu tượng lịch</w:t>
-      </w:r>
-      <w:r>
-        <w:t xml:space="preserve"> trên thanh trên cùng sẽ mở thẳng lịch các lớp.</w:t>
+        <w:t xml:space="preserve"> của trang Lớp học. Quản lý cũng dùng chế độ Lịch để rà nhanh những lớp có </w:t>
+      </w:r>
+      <w:r>
+        <w:rPr>
+          <w:b/>
+          <w:bCs/>
+        </w:rPr>
+        <w:t xml:space="preserve">chấm đỏ</w:t>
+      </w:r>
+      <w:r>
+        <w:t xml:space="preserve"> (còn thiếu người) mà mời thêm người.</w:t>
       </w:r>
     </w:p>
     <w:p>
@@ -24194,10 +24125,10 @@
           <w:b/>
           <w:bCs/>
         </w:rPr>
-        <w:t xml:space="preserve">Lịch dạy của tôi</w:t>
-      </w:r>
-      <w:r>
-        <w:t xml:space="preserve"> (mục 3.6) để biết giờ và địa điểm.</w:t>
+        <w:t xml:space="preserve">Lớp học → Lịch → Của tôi</w:t>
+      </w:r>
+      <w:r>
+        <w:t xml:space="preserve"> (mục 3.6) để biết giờ dạy, rồi bấm vào lớp để xem địa điểm.</w:t>
       </w:r>
     </w:p>
     <w:p>

</xml_diff>

<commit_message>
Thông báo "Lớp sắp mở đăng ký": gộp mỗi người 1 thông báo "N lớp", không đẩy push thêm
Tránh dồn dập khi nhập cả kế hoạch năm bằng CSV (mỗi lớp Dự kiến công khai sớm từng gửi 1 thông báo + push).
Bảng thong_bao_lop_sap_mo chống báo lặp + đếm N; đã đọc rồi mới tạo thông báo mới. Test 16 kiểm tra.

Co-Authored-By: Claude Opus 5.5 <noreply@anthropic.com>
</commit_message>
<xml_diff>
--- a/huong dan su dung.docx
+++ b/huong dan su dung.docx
@@ -9281,7 +9281,17 @@
         <w:t xml:space="preserve">"Lớp sắp mở đăng ký"</w:t>
       </w:r>
       <w:r>
-        <w:t xml:space="preserve"> khi có lớp Dự kiến phù hợp với bạn được công khai), </w:t>
+        <w:t xml:space="preserve"> khi có lớp Dự kiến phù hợp với bạn được công khai — nhiều lớp cùng lúc được </w:t>
+      </w:r>
+      <w:r>
+        <w:rPr>
+          <w:b/>
+          <w:bCs/>
+        </w:rPr>
+        <w:t xml:space="preserve">gộp thành 1 thông báo</w:t>
+      </w:r>
+      <w:r>
+        <w:t xml:space="preserve"> "N lớp sắp mở đăng ký", bấm vào mở Lịch), </w:t>
       </w:r>
       <w:r>
         <w:rPr>

</xml_diff>

<commit_message>
Sửa giao diện điện thoại khổ hẹp: thẻ/hàng bị đẩy rộng và bị cắt, ô lọc cắt chữ, tab Lịch sáng sai
- Thêm grid-cols-1 cho 20+ lưới trên điện thoại (lưới không khai báo cột rộng theo nội dung dài nhất)
- Thẻ lớp: địa chỉ dài được rút gọn thay vì đẩy thẻ tràn màn hình; điểm KPI bảng xếp hạng báo cáo không còn bị cắt
- Ô chọn kỳ báo cáo chiếm hết bề ngang trên điện thoại; danh mục cấu hình không lố khung
- Ô lọc lớp rút nhãn (Nhóm lớp/Trạng thái/Đối tượng/Kinh phí); tiêu đề tháng của Lịch 1 dòng
- Tab Lịch ở đáy chỉ sáng khi đang ở chế độ Lịch
- Ghi quy tắc vào CLAUDE.md mục 8.9; chụp lại ảnh 3.2, dựng lại PDF + Word

Co-Authored-By: Claude Opus 5.5 <noreply@anthropic.com>
</commit_message>
<xml_diff>
--- a/huong dan su dung.docx
+++ b/huong dan su dung.docx
@@ -26073,16 +26073,32 @@
                 <w:sz w:val="19"/>
                 <w:szCs w:val="19"/>
               </w:rPr>
-              <w:t xml:space="preserve"> chưa công khai (chỉ quản lý thấy). Hoặc bộ lọc đang chặn, hãy chọn lại </w:t>
-            </w:r>
-            <w:r>
-              <w:rPr>
-                <w:b/>
-                <w:bCs/>
-                <w:sz w:val="19"/>
-                <w:szCs w:val="19"/>
-              </w:rPr>
-              <w:t xml:space="preserve">Mọi trạng thái</w:t>
+              <w:t xml:space="preserve"> chưa công khai (chỉ quản lý thấy). Hoặc bộ lọc đang chặn, hãy bấm </w:t>
+            </w:r>
+            <w:r>
+              <w:rPr>
+                <w:b/>
+                <w:bCs/>
+                <w:sz w:val="19"/>
+                <w:szCs w:val="19"/>
+              </w:rPr>
+              <w:t xml:space="preserve">Xóa lọc</w:t>
+            </w:r>
+            <w:r>
+              <w:rPr>
+                <w:sz w:val="19"/>
+                <w:szCs w:val="19"/>
+              </w:rPr>
+              <w:t xml:space="preserve"> hoặc chọn lại ô </w:t>
+            </w:r>
+            <w:r>
+              <w:rPr>
+                <w:b/>
+                <w:bCs/>
+                <w:sz w:val="19"/>
+                <w:szCs w:val="19"/>
+              </w:rPr>
+              <w:t xml:space="preserve">Nhóm lớp</w:t>
             </w:r>
             <w:r>
               <w:rPr>
@@ -26098,14 +26114,14 @@
                 <w:sz w:val="19"/>
                 <w:szCs w:val="19"/>
               </w:rPr>
-              <w:t xml:space="preserve">Mọi nhóm lớp</w:t>
-            </w:r>
-            <w:r>
-              <w:rPr>
-                <w:sz w:val="19"/>
-                <w:szCs w:val="19"/>
-              </w:rPr>
-              <w:t xml:space="preserve">…</w:t>
+              <w:t xml:space="preserve">Trạng thái</w:t>
+            </w:r>
+            <w:r>
+              <w:rPr>
+                <w:sz w:val="19"/>
+                <w:szCs w:val="19"/>
+              </w:rPr>
+              <w:t xml:space="preserve">… về dòng đầu tiên (tất cả).</w:t>
             </w:r>
           </w:p>
         </w:tc>

</xml_diff>

<commit_message>
Hướng dẫn sử dụng: bổ sung thông báo "Lớp sắp mở đăng ký" vào danh sách loại thông báo (mục 3.8)
Co-Authored-By: Claude Opus 5.5 <noreply@anthropic.com>
</commit_message>
<xml_diff>
--- a/huong dan su dung.docx
+++ b/huong dan su dung.docx
@@ -9051,7 +9051,17 @@
         <w:jc w:val="both"/>
       </w:pPr>
       <w:r>
-        <w:t xml:space="preserve">Lớp hoặc Bài mới còn trống phù hợp với bạn; bạn được mời dạy; đăng ký của bạn được duyệt, bị từ chối hoặc bị đóng vì slot đã đủ người; lời mời bị thu hồi; lớp hoặc Bài đã phân công của bạn </w:t>
+        <w:t xml:space="preserve">Lớp hoặc Bài mới còn trống phù hợp với bạn; </w:t>
+      </w:r>
+      <w:r>
+        <w:rPr>
+          <w:b/>
+          <w:bCs/>
+        </w:rPr>
+        <w:t xml:space="preserve">lớp sắp mở đăng ký</w:t>
+      </w:r>
+      <w:r>
+        <w:t xml:space="preserve"> phù hợp với bạn (nhiều lớp gộp thành 1 thông báo); bạn được mời dạy; đăng ký của bạn được duyệt, bị từ chối hoặc bị đóng vì slot đã đủ người; lời mời bị thu hồi; lớp hoặc Bài đã phân công của bạn </w:t>
       </w:r>
       <w:r>
         <w:rPr>

</xml_diff>

<commit_message>
Trang chi tiết lớp: sửa thanh đăng ký che Bài trên điện thoại; gợi ý nhân sự thu gọn sẵn, hiện 3 người
- Card BaiList dùng overflow-clip để thanh sticky dính theo màn hình, không đè lên Bài
- GoiYBai: thu gọn sẵn (kèm số người), mở ra hiện 3 người đầu; cảnh báo/việc chờ xử lý luôn hiện
- Sửa xuống dòng xấu ở khổ hẹp (điểm gợi ý, tên trong slot)
- Hướng dẫn 3.4.3, 5.4 + chụp lại ảnh 3.4a, 5.4 (cập nhật mã lớp demo mới trong script chụp); dựng lại PDF + Word

Co-Authored-By: Claude Opus 5.5 <noreply@anthropic.com>
</commit_message>
<xml_diff>
--- a/huong dan su dung.docx
+++ b/huong dan su dung.docx
@@ -85,7 +85,7 @@
           <w:sz w:val="20"/>
           <w:szCs w:val="20"/>
         </w:rPr>
-        <w:t xml:space="preserve">Phiên bản 1.0 · cập nhật ngày 26/10/2026</w:t>
+        <w:t xml:space="preserve">Phiên bản 1.0 · cập nhật ngày 28/10/2026</w:t>
       </w:r>
     </w:p>
     <w:p>
@@ -7437,7 +7437,47 @@
         <w:t xml:space="preserve">hiển thị công khai cho mọi người</w:t>
       </w:r>
       <w:r>
-        <w:t xml:space="preserve"> (không chỉ quản lý), để ai cũng biết cách chia việc hoạt động ra sao. Bạn tìm dòng có chữ </w:t>
+        <w:t xml:space="preserve"> (không chỉ quản lý), để ai cũng biết cách chia việc hoạt động ra sao. Để trang gọn với lớp nhiều Bài, bảng </w:t>
+      </w:r>
+      <w:r>
+        <w:rPr>
+          <w:b/>
+          <w:bCs/>
+        </w:rPr>
+        <w:t xml:space="preserve">thu gọn sẵn</w:t>
+      </w:r>
+      <w:r>
+        <w:t xml:space="preserve">: dòng </w:t>
+      </w:r>
+      <w:r>
+        <w:rPr>
+          <w:b/>
+          <w:bCs/>
+        </w:rPr>
+        <w:t xml:space="preserve">Gợi ý nhân sự · Giảng viên/Trợ giảng</w:t>
+      </w:r>
+      <w:r>
+        <w:t xml:space="preserve"> cho biết có bao nhiêu người, bấm vào để mở. Khi mở, bảng hiện </w:t>
+      </w:r>
+      <w:r>
+        <w:rPr>
+          <w:b/>
+          <w:bCs/>
+        </w:rPr>
+        <w:t xml:space="preserve">3 người đầu</w:t>
+      </w:r>
+      <w:r>
+        <w:t xml:space="preserve">, bấm </w:t>
+      </w:r>
+      <w:r>
+        <w:rPr>
+          <w:b/>
+          <w:bCs/>
+        </w:rPr>
+        <w:t xml:space="preserve">Xem thêm</w:t>
+      </w:r>
+      <w:r>
+        <w:t xml:space="preserve"> để thấy hết. Bạn tìm dòng có chữ </w:t>
       </w:r>
       <w:r>
         <w:rPr>
@@ -18551,7 +18591,37 @@
         <w:t xml:space="preserve">Gợi ý nhân sự</w:t>
       </w:r>
       <w:r>
-        <w:t xml:space="preserve"> hiện ngay dưới Bài.</w:t>
+        <w:t xml:space="preserve"> nằm ngay dưới Bài, </w:t>
+      </w:r>
+      <w:r>
+        <w:rPr>
+          <w:b/>
+          <w:bCs/>
+        </w:rPr>
+        <w:t xml:space="preserve">thu gọn sẵn</w:t>
+      </w:r>
+      <w:r>
+        <w:t xml:space="preserve"> (bấm để mở; hiện 3 người đầu, bấm </w:t>
+      </w:r>
+      <w:r>
+        <w:rPr>
+          <w:b/>
+          <w:bCs/>
+        </w:rPr>
+        <w:t xml:space="preserve">Xem thêm</w:t>
+      </w:r>
+      <w:r>
+        <w:t xml:space="preserve"> để thấy hết). Cảnh báo pool nhỏ và các đăng ký/lời mời đang chờ xử lý thì </w:t>
+      </w:r>
+      <w:r>
+        <w:rPr>
+          <w:b/>
+          <w:bCs/>
+        </w:rPr>
+        <w:t xml:space="preserve">luôn hiện</w:t>
+      </w:r>
+      <w:r>
+        <w:t xml:space="preserve">, không bị thu gọn.</w:t>
       </w:r>
     </w:p>
     <w:p>

</xml_diff>